<commit_message>
feat: update company details and contract specifics for Pismo agreement
Updated legal address, signatory details, and contract number for Pismo agreement.

Co-authored-by: SecondNiceee <154639449+SecondNiceee@users.noreply.github.com>
</commit_message>
<xml_diff>
--- a/response/Приложение №1 - Перечень ПДн.docx
+++ b/response/Приложение №1 - Перечень ПДн.docx
@@ -41,7 +41,7 @@
       </w:pPr>
       <w:r>
         <w:rPr/>
-        <w:t xml:space="preserve">г. ____________________ «____» ________________ 20__ г.</w:t>
+        <w:t xml:space="preserve">г. Москва «____» ________________ 2026 г.</w:t>
       </w:r>
     </w:p>
     <w:p>
@@ -56,7 +56,7 @@
       </w:r>
       <w:r>
         <w:rPr/>
-        <w:t xml:space="preserve"> [полное наименование], ИНН [ИНН], ОГРН [ОГРН], адрес: [юридический адрес], в лице [должность, ФИО], действующего на основании [основание],</w:t>
+        <w:t xml:space="preserve"> Общество с ограниченной ответственностью «АРИТМЕД» (ООО «АРИТМЕД»), ОГРН 1227700287330, ИНН 9726013334, адрес: г. Москва, [указать полный юридический адрес], в лице [должность, ФИО], действующего на основании [Устава / доверенности],</w:t>
       </w:r>
     </w:p>
     <w:p>
@@ -80,7 +80,7 @@
       </w:pPr>
       <w:r>
         <w:rPr/>
-        <w:t xml:space="preserve">совместно именуемые Стороны, составили настоящее Приложение № 1 к Соглашению об обработке персональных данных (далее — Соглашение), заключённому в рамках договора оказания услуг № ____________ (услуга «Облако 152-ФЗ»).</w:t>
+        <w:t xml:space="preserve">совместно именуемые Стороны, составили настоящее Приложение № 1 к Соглашению об обработке персональных данных (далее — Соглашение), заключённому в рамках договора оказания услуг № 15187386 (услуга «Облако 152-ФЗ»).</w:t>
       </w:r>
     </w:p>
     <w:p>
@@ -929,16 +929,34 @@
       </w:pPr>
       <w:r>
         <w:rPr/>
-        <w:t xml:space="preserve">Оператор:                                        Обработчик:</w:t>
-      </w:r>
-    </w:p>
-    <w:p>
-      <w:pPr>
-        <w:spacing w:after="120"/>
-      </w:pPr>
-      <w:r>
-        <w:rPr/>
-        <w:t xml:space="preserve">__________________ / __________   __________________ / __________</w:t>
+        <w:t xml:space="preserve">Оператор        Обработчик</w:t>
+      </w:r>
+    </w:p>
+    <w:p>
+      <w:pPr>
+        <w:spacing w:after="120"/>
+      </w:pPr>
+      <w:r>
+        <w:rPr/>
+        <w:t xml:space="preserve">ООО «АРИТМЕД»        ООО «РЕГ.РУ»</w:t>
+      </w:r>
+    </w:p>
+    <w:p>
+      <w:pPr>
+        <w:spacing w:after="120"/>
+      </w:pPr>
+      <w:r>
+        <w:rPr/>
+        <w:t xml:space="preserve">__________________ / __________        __________________ / __________</w:t>
+      </w:r>
+    </w:p>
+    <w:p>
+      <w:pPr>
+        <w:spacing w:after="120"/>
+      </w:pPr>
+      <w:r>
+        <w:rPr/>
+        <w:t xml:space="preserve">М.П.        М.П.</w:t>
       </w:r>
     </w:p>
     <w:sectPr>

</xml_diff>

<commit_message>
feat: update legal operator details and data destruction terms
Updated operator role and destruction timeline to comply with legal requirements.

Co-authored-by: SecondNiceee <154639449+SecondNiceee@users.noreply.github.com>
</commit_message>
<xml_diff>
--- a/response/Приложение №1 - Перечень ПДн.docx
+++ b/response/Приложение №1 - Перечень ПДн.docx
@@ -56,7 +56,7 @@
       </w:r>
       <w:r>
         <w:rPr/>
-        <w:t xml:space="preserve"> Общество с ограниченной ответственностью «АРИТМЕД» (ООО «АРИТМЕД»), ОГРН 1227700287330, ИНН 9726013334, адрес: г. Москва, [указать полный юридический адрес], в лице [должность, ФИО], действующего на основании [Устава / доверенности],</w:t>
+        <w:t xml:space="preserve"> Общество с ограниченной ответственностью «АРИТМЕД» (ООО «АРИТМЕД»), ОГРН 1227700287330, ИНН 9726013334, адрес: г. Москва, [указать полный юридический адрес], в лице [должность строго как в ЕГРЮЛ: директора / генерального директора] [ФИО в родительном падеже], действующего на основании Устава,</w:t>
       </w:r>
     </w:p>
     <w:p>
@@ -880,7 +880,26 @@
       </w:pPr>
       <w:r>
         <w:rPr/>
-        <w:t xml:space="preserve">6.2. Порядок и сроки уничтожения персональных данных после прекращения договора определяются Соглашением. Стороны согласовали, что срок хранения персональных данных, указанных в пункте 2.2, после расторжения договора составляет не более ____ календарных дней, по истечении которых данные подлежат уничтожению с составлением акта.</w:t>
+        <w:t xml:space="preserve">6.2. Порядок и сроки уничтожения персональных данных после прекращения договора определяются Соглашением. Стороны согласовали, что в отношении персональных данных, указанных в пункте 2.2, срок хранения после полного исполнения обязательств по договору либо его расторжения составляет </w:t>
+      </w:r>
+      <w:r>
+        <w:rPr>
+          <w:b/>
+        </w:rPr>
+        <w:t xml:space="preserve">не более 30 (тридцати) календарных дней</w:t>
+      </w:r>
+      <w:r>
+        <w:rPr/>
+        <w:t xml:space="preserve"> — с учётом требования части 4 статьи 21 Федерального закона № 152-ФЗ об уничтожении персональных данных в срок, не превышающий 30 дней с даты достижения цели обработки. Указанный срок применяется вместо срока, установленного пунктом 7.2 Соглашения.</w:t>
+      </w:r>
+    </w:p>
+    <w:p>
+      <w:pPr>
+        <w:spacing w:after="120"/>
+      </w:pPr>
+      <w:r>
+        <w:rPr/>
+        <w:t xml:space="preserve">6.3. По истечении срока, указанного в пункте 6.2, персональные данные, включая резервные копии, подлежат уничтожению с составлением акта об уничтожении, который направляется Оператору без дополнительного запроса.</w:t>
       </w:r>
     </w:p>
     <w:p>

</xml_diff>

<commit_message>
feat: update document details and storage period clarification
Updated address and storage period details; clarified storage period for medical data destruction.

Co-authored-by: SecondNiceee <154639449+SecondNiceee@users.noreply.github.com>
</commit_message>
<xml_diff>
--- a/response/Приложение №1 - Перечень ПДн.docx
+++ b/response/Приложение №1 - Перечень ПДн.docx
@@ -56,7 +56,7 @@
       </w:r>
       <w:r>
         <w:rPr/>
-        <w:t xml:space="preserve"> Общество с ограниченной ответственностью «АРИТМЕД» (ООО «АРИТМЕД»), ОГРН 1227700287330, ИНН 9726013334, адрес: г. Москва, [указать полный юридический адрес], в лице [должность строго как в ЕГРЮЛ: директора / генерального директора] [ФИО в родительном падеже], действующего на основании Устава,</w:t>
+        <w:t xml:space="preserve"> Общество с ограниченной ответственностью «АРИТМЕД» (ООО «АРИТМЕД»), ОГРН 1227700287330, ИНН 9726013334, адрес: 117570, город Москва, ул. Красного Маяка, д. 11, к. 5, кв. 36, в лице генерального директора Кульбачинской Екатерины Константиновны, действующей на основании Устава,</w:t>
       </w:r>
     </w:p>
     <w:p>
@@ -966,7 +966,16 @@
       </w:pPr>
       <w:r>
         <w:rPr/>
-        <w:t xml:space="preserve">__________________ / __________        __________________ / __________</w:t>
+        <w:t xml:space="preserve">Генеральный директор        ________________________</w:t>
+      </w:r>
+    </w:p>
+    <w:p>
+      <w:pPr>
+        <w:spacing w:after="120"/>
+      </w:pPr>
+      <w:r>
+        <w:rPr/>
+        <w:t xml:space="preserve">______________ / Е. К. Кульбачинская        ______________ / ____________</w:t>
       </w:r>
     </w:p>
     <w:p>

</xml_diff>